<commit_message>
Batch 3: Ma 16 + Joey 16 - cross-references added
</commit_message>
<xml_diff>
--- a/stories/docx/Joey 16.docx
+++ b/stories/docx/Joey 16.docx
@@ -23,7 +23,7 @@
         <w:pStyle w:val="BodyText"/>
       </w:pPr>
       <w:r>
-        <w:t xml:space="preserve">He walked in like he owned the place. No knock, no hello, just pushed through the door and started looking around like he was checking the inventory for himself. I was behind the counter. Ma was in the back, cooking. He looked at me and smiled — that smile, you know the one — and said,</w:t>
+        <w:t xml:space="preserve">He walked in like he owned the place. No knock, no hello. He looked at me and smiled — that smile — and said,</w:t>
       </w:r>
       <w:r>
         <w:t xml:space="preserve"> </w:t>
@@ -43,15 +43,7 @@
         <w:pStyle w:val="BodyText"/>
       </w:pPr>
       <w:r>
-        <w:t xml:space="preserve">I did not answer. I just watched him.</w:t>
-      </w:r>
-    </w:p>
-    <w:p>
-      <w:pPr>
-        <w:pStyle w:val="BodyText"/>
-      </w:pPr>
-      <w:r>
-        <w:t xml:space="preserve">He kept going.</w:t>
+        <w:t xml:space="preserve">I did not answer. I just watched him. He kept going.</w:t>
       </w:r>
       <w:r>
         <w:t xml:space="preserve"> </w:t>
@@ -132,6 +124,22 @@
       </w:pPr>
       <w:r>
         <w:t xml:space="preserve">Ma asked who that man was. I told her a customer. She did not believe me. I could see it in her eyes, but she did not push. She has enough to worry about with Frank over there.</w:t>
+      </w:r>
+    </w:p>
+    <w:p>
+      <w:pPr>
+        <w:pStyle w:val="BodyText"/>
+      </w:pPr>
+      <w:r>
+        <w:t xml:space="preserve">I got a letter from Frank last month. He is still in the fight. He mentioned a girl — Lucia. Someone who changed him. I hope she is keeping him safe.</w:t>
+      </w:r>
+    </w:p>
+    <w:p>
+      <w:pPr>
+        <w:pStyle w:val="BodyText"/>
+      </w:pPr>
+      <w:r>
+        <w:t xml:space="preserve">I cannot think about that now. I have my own battle here.</w:t>
       </w:r>
     </w:p>
     <w:p>

</xml_diff>